<commit_message>
feat: adiciona middleware de segurança, rate limiting, crypto utils, 404 page e atualiza formulários
</commit_message>
<xml_diff>
--- a/app/templates/anexo1_template.docx
+++ b/app/templates/anexo1_template.docx
@@ -147,8 +147,6 @@
           <w:sz w:val="32"/>
         </w:rPr>
       </w:pPr>
-      <w:bookmarkStart w:id="0" w:name="_GoBack"/>
-      <w:bookmarkEnd w:id="0"/>
       <w:r>
         <w:rPr>
           <w:rFonts w:ascii="CIDFont+F2" w:hAnsi="CIDFont+F2" w:eastAsia="CIDFont+F2"/>
@@ -215,9 +213,9 @@
       </w:tblPr>
       <w:tblGrid>
         <w:gridCol w:w="2114"/>
-        <w:gridCol w:w="575"/>
-        <w:gridCol w:w="1325"/>
-        <w:gridCol w:w="450"/>
+        <w:gridCol w:w="687"/>
+        <w:gridCol w:w="1350"/>
+        <w:gridCol w:w="313"/>
         <w:gridCol w:w="2120"/>
         <w:gridCol w:w="92"/>
         <w:gridCol w:w="731"/>
@@ -230,7 +228,7 @@
         </w:trPr>
         <w:tc>
           <w:tcPr>
-            <w:tcW w:w="2689" w:type="dxa"/>
+            <w:tcW w:w="2801" w:type="dxa"/>
             <w:gridSpan w:val="2"/>
             <w:tcBorders>
               <w:top w:val="single" w:color="000000" w:sz="0" w:space="0"/>
@@ -286,7 +284,7 @@
         </w:tc>
         <w:tc>
           <w:tcPr>
-            <w:tcW w:w="8010" w:type="dxa"/>
+            <w:tcW w:w="7898" w:type="dxa"/>
             <w:gridSpan w:val="7"/>
             <w:tcBorders>
               <w:top w:val="single" w:color="000000" w:sz="0" w:space="0"/>
@@ -1686,7 +1684,7 @@
         </w:tc>
         <w:tc>
           <w:tcPr>
-            <w:tcW w:w="1900" w:type="dxa"/>
+            <w:tcW w:w="2037" w:type="dxa"/>
             <w:gridSpan w:val="2"/>
             <w:vMerge w:val="restart"/>
             <w:tcBorders>
@@ -1724,7 +1722,7 @@
         </w:tc>
         <w:tc>
           <w:tcPr>
-            <w:tcW w:w="2662" w:type="dxa"/>
+            <w:tcW w:w="2525" w:type="dxa"/>
             <w:gridSpan w:val="3"/>
             <w:vMerge w:val="restart"/>
             <w:tcBorders>
@@ -1874,7 +1872,7 @@
         </w:tc>
         <w:tc>
           <w:tcPr>
-            <w:tcW w:w="1900" w:type="dxa"/>
+            <w:tcW w:w="2037" w:type="dxa"/>
             <w:gridSpan w:val="2"/>
             <w:vMerge w:val="continue"/>
             <w:tcBorders>
@@ -1896,7 +1894,7 @@
         </w:tc>
         <w:tc>
           <w:tcPr>
-            <w:tcW w:w="2662" w:type="dxa"/>
+            <w:tcW w:w="2525" w:type="dxa"/>
             <w:gridSpan w:val="3"/>
             <w:vMerge w:val="continue"/>
             <w:tcBorders>
@@ -2070,7 +2068,7 @@
         </w:tc>
         <w:tc>
           <w:tcPr>
-            <w:tcW w:w="1900" w:type="dxa"/>
+            <w:tcW w:w="2037" w:type="dxa"/>
             <w:gridSpan w:val="2"/>
             <w:vMerge w:val="restart"/>
             <w:tcBorders>
@@ -2105,7 +2103,7 @@
         </w:tc>
         <w:tc>
           <w:tcPr>
-            <w:tcW w:w="2662" w:type="dxa"/>
+            <w:tcW w:w="2525" w:type="dxa"/>
             <w:gridSpan w:val="3"/>
             <w:vMerge w:val="restart"/>
             <w:tcBorders>
@@ -2244,7 +2242,7 @@
         </w:tc>
         <w:tc>
           <w:tcPr>
-            <w:tcW w:w="1900" w:type="dxa"/>
+            <w:tcW w:w="2037" w:type="dxa"/>
             <w:gridSpan w:val="2"/>
             <w:vMerge w:val="continue"/>
             <w:tcBorders>
@@ -2264,7 +2262,7 @@
         </w:tc>
         <w:tc>
           <w:tcPr>
-            <w:tcW w:w="2662" w:type="dxa"/>
+            <w:tcW w:w="2525" w:type="dxa"/>
             <w:gridSpan w:val="3"/>
             <w:vMerge w:val="continue"/>
             <w:tcBorders>
@@ -2639,6 +2637,8 @@
               </w:rPr>
               <w:t xml:space="preserve">TRANSPORTE: </w:t>
             </w:r>
+            <w:bookmarkStart w:id="0" w:name="_GoBack"/>
+            <w:bookmarkEnd w:id="0"/>
           </w:p>
         </w:tc>
       </w:tr>
@@ -3871,7 +3871,7 @@
           <w:color w:val="000000"/>
           <w:sz w:val="24"/>
         </w:rPr>
-        <w:t xml:space="preserve">Em {{data_emissao_documento}} </w:t>
+        <w:t xml:space="preserve">Em ________________________________ </w:t>
       </w:r>
     </w:p>
     <w:p>

</xml_diff>